<commit_message>
Report: add risk-difference intervals and gap analysis for the email experiment
Co-Authored-By: Claude Sonnet 5.5 <noreply@anthropic.com>
Claude-Session: https://claude.ai/code/session_01VRbK37d38KZhVAbWS4xw4x
</commit_message>
<xml_diff>
--- a/llm-count-study/research_report_en_v2.docx
+++ b/llm-count-study/research_report_en_v2.docx
@@ -7709,16 +7709,15 @@
         </w:tblBorders>
       </w:tblPr>
       <w:tblGrid>
-        <w:gridCol w:w="792"/>
-        <w:gridCol w:w="792"/>
-        <w:gridCol w:w="792"/>
-        <w:gridCol w:w="792"/>
-        <w:gridCol w:w="792"/>
-        <w:gridCol w:w="792"/>
-        <w:gridCol w:w="792"/>
-        <w:gridCol w:w="792"/>
-        <w:gridCol w:w="792"/>
-        <w:gridCol w:w="792"/>
+        <w:gridCol w:w="879"/>
+        <w:gridCol w:w="879"/>
+        <w:gridCol w:w="879"/>
+        <w:gridCol w:w="879"/>
+        <w:gridCol w:w="879"/>
+        <w:gridCol w:w="879"/>
+        <w:gridCol w:w="879"/>
+        <w:gridCol w:w="879"/>
+        <w:gridCol w:w="879"/>
       </w:tblGrid>
       <w:tr>
         <w:trPr>
@@ -7820,7 +7819,7 @@
                 <w:b/>
                 <w:sz w:val="16"/>
               </w:rPr>
-              <w:t xml:space="preserve">Men’s</w:t>
+              <w:t xml:space="preserve">Lift, men’s email [95% CI]</w:t>
             </w:r>
           </w:p>
         </w:tc>
@@ -7840,7 +7839,7 @@
                 <w:b/>
                 <w:sz w:val="16"/>
               </w:rPr>
-              <w:t xml:space="preserve">Women’s</w:t>
+              <w:t xml:space="preserve">Lift, women’s email [95% CI]</w:t>
             </w:r>
           </w:p>
         </w:tc>
@@ -7860,7 +7859,7 @@
                 <w:b/>
                 <w:sz w:val="16"/>
               </w:rPr>
-              <w:t xml:space="preserve">Lift men</w:t>
+              <w:t xml:space="preserve">Gap men minus women [95% CI]</w:t>
             </w:r>
           </w:p>
         </w:tc>
@@ -7880,7 +7879,7 @@
                 <w:b/>
                 <w:sz w:val="16"/>
               </w:rPr>
-              <w:t xml:space="preserve">Lift women</w:t>
+              <w:t xml:space="preserve">RR men</w:t>
             </w:r>
           </w:p>
         </w:tc>
@@ -7900,26 +7899,6 @@
                 <w:b/>
                 <w:sz w:val="16"/>
               </w:rPr>
-              <w:t xml:space="preserve">RR men</w:t>
-            </w:r>
-          </w:p>
-        </w:tc>
-        <w:tc>
-          <w:tcPr>
-            <w:shd w:val="clear" w:fill="E7E6E2"/>
-          </w:tcPr>
-          <w:p>
-            <w:pPr>
-              <w:pStyle w:val="Compact"/>
-              <w:spacing w:before="20" w:after="20"/>
-              <w:jc w:val="left"/>
-            </w:pPr>
-            <w:r>
-              <w:rPr>
-                <w:rFonts w:ascii="Calibri" w:hAnsi="Calibri"/>
-                <w:b/>
-                <w:sz w:val="16"/>
-              </w:rPr>
               <w:t xml:space="preserve">RR women</w:t>
             </w:r>
           </w:p>
@@ -7999,58 +7978,41 @@
                 <w:rFonts w:ascii="Calibri" w:hAnsi="Calibri"/>
                 <w:sz w:val="16"/>
               </w:rPr>
-              <w:t xml:space="preserve">0.183</w:t>
-            </w:r>
-          </w:p>
-        </w:tc>
-        <w:tc>
-          <w:tcPr/>
-          <w:p>
-            <w:pPr>
-              <w:pStyle w:val="Compact"/>
-              <w:spacing w:before="20" w:after="20"/>
-              <w:jc w:val="left"/>
-            </w:pPr>
-            <w:r>
-              <w:rPr>
-                <w:rFonts w:ascii="Calibri" w:hAnsi="Calibri"/>
-                <w:sz w:val="16"/>
-              </w:rPr>
-              <w:t xml:space="preserve">0.151</w:t>
-            </w:r>
-          </w:p>
-        </w:tc>
-        <w:tc>
-          <w:tcPr/>
-          <w:p>
-            <w:pPr>
-              <w:pStyle w:val="Compact"/>
-              <w:spacing w:before="20" w:after="20"/>
-              <w:jc w:val="left"/>
-            </w:pPr>
-            <w:r>
-              <w:rPr>
-                <w:rFonts w:ascii="Calibri" w:hAnsi="Calibri"/>
-                <w:sz w:val="16"/>
-              </w:rPr>
-              <w:t xml:space="preserve">+0.077</w:t>
-            </w:r>
-          </w:p>
-        </w:tc>
-        <w:tc>
-          <w:tcPr/>
-          <w:p>
-            <w:pPr>
-              <w:pStyle w:val="Compact"/>
-              <w:spacing w:before="20" w:after="20"/>
-              <w:jc w:val="left"/>
-            </w:pPr>
-            <w:r>
-              <w:rPr>
-                <w:rFonts w:ascii="Calibri" w:hAnsi="Calibri"/>
-                <w:sz w:val="16"/>
-              </w:rPr>
-              <w:t xml:space="preserve">+0.045</w:t>
+              <w:t xml:space="preserve">+0.077 [+0.070, +0.083]</w:t>
+            </w:r>
+          </w:p>
+        </w:tc>
+        <w:tc>
+          <w:tcPr/>
+          <w:p>
+            <w:pPr>
+              <w:pStyle w:val="Compact"/>
+              <w:spacing w:before="20" w:after="20"/>
+              <w:jc w:val="left"/>
+            </w:pPr>
+            <w:r>
+              <w:rPr>
+                <w:rFonts w:ascii="Calibri" w:hAnsi="Calibri"/>
+                <w:sz w:val="16"/>
+              </w:rPr>
+              <w:t xml:space="preserve">+0.045 [+0.039, +0.052]</w:t>
+            </w:r>
+          </w:p>
+        </w:tc>
+        <w:tc>
+          <w:tcPr/>
+          <w:p>
+            <w:pPr>
+              <w:pStyle w:val="Compact"/>
+              <w:spacing w:before="20" w:after="20"/>
+              <w:jc w:val="left"/>
+            </w:pPr>
+            <w:r>
+              <w:rPr>
+                <w:rFonts w:ascii="Calibri" w:hAnsi="Calibri"/>
+                <w:sz w:val="16"/>
+              </w:rPr>
+              <w:t xml:space="preserve">+0.031 [+0.024, +0.038]</w:t>
             </w:r>
           </w:p>
         </w:tc>
@@ -8163,58 +8125,41 @@
                 <w:rFonts w:ascii="Calibri" w:hAnsi="Calibri"/>
                 <w:sz w:val="16"/>
               </w:rPr>
-              <w:t xml:space="preserve">0.0125</w:t>
-            </w:r>
-          </w:p>
-        </w:tc>
-        <w:tc>
-          <w:tcPr/>
-          <w:p>
-            <w:pPr>
-              <w:pStyle w:val="Compact"/>
-              <w:spacing w:before="20" w:after="20"/>
-              <w:jc w:val="left"/>
-            </w:pPr>
-            <w:r>
-              <w:rPr>
-                <w:rFonts w:ascii="Calibri" w:hAnsi="Calibri"/>
-                <w:sz w:val="16"/>
-              </w:rPr>
-              <w:t xml:space="preserve">0.0088</w:t>
-            </w:r>
-          </w:p>
-        </w:tc>
-        <w:tc>
-          <w:tcPr/>
-          <w:p>
-            <w:pPr>
-              <w:pStyle w:val="Compact"/>
-              <w:spacing w:before="20" w:after="20"/>
-              <w:jc w:val="left"/>
-            </w:pPr>
-            <w:r>
-              <w:rPr>
-                <w:rFonts w:ascii="Calibri" w:hAnsi="Calibri"/>
-                <w:sz w:val="16"/>
-              </w:rPr>
-              <w:t xml:space="preserve">+0.0068</w:t>
-            </w:r>
-          </w:p>
-        </w:tc>
-        <w:tc>
-          <w:tcPr/>
-          <w:p>
-            <w:pPr>
-              <w:pStyle w:val="Compact"/>
-              <w:spacing w:before="20" w:after="20"/>
-              <w:jc w:val="left"/>
-            </w:pPr>
-            <w:r>
-              <w:rPr>
-                <w:rFonts w:ascii="Calibri" w:hAnsi="Calibri"/>
-                <w:sz w:val="16"/>
-              </w:rPr>
-              <w:t xml:space="preserve">+0.0031</w:t>
+              <w:t xml:space="preserve">+0.0068 [+0.0050, +0.0086]</w:t>
+            </w:r>
+          </w:p>
+        </w:tc>
+        <w:tc>
+          <w:tcPr/>
+          <w:p>
+            <w:pPr>
+              <w:pStyle w:val="Compact"/>
+              <w:spacing w:before="20" w:after="20"/>
+              <w:jc w:val="left"/>
+            </w:pPr>
+            <w:r>
+              <w:rPr>
+                <w:rFonts w:ascii="Calibri" w:hAnsi="Calibri"/>
+                <w:sz w:val="16"/>
+              </w:rPr>
+              <w:t xml:space="preserve">+0.0031 [+0.0015, +0.0047]</w:t>
+            </w:r>
+          </w:p>
+        </w:tc>
+        <w:tc>
+          <w:tcPr/>
+          <w:p>
+            <w:pPr>
+              <w:pStyle w:val="Compact"/>
+              <w:spacing w:before="20" w:after="20"/>
+              <w:jc w:val="left"/>
+            </w:pPr>
+            <w:r>
+              <w:rPr>
+                <w:rFonts w:ascii="Calibri" w:hAnsi="Calibri"/>
+                <w:sz w:val="16"/>
+              </w:rPr>
+              <w:t xml:space="preserve">+0.0037 [+0.0017, +0.0056]</w:t>
             </w:r>
           </w:p>
         </w:tc>
@@ -8335,58 +8280,41 @@
                 <w:rFonts w:ascii="Calibri" w:hAnsi="Calibri"/>
                 <w:sz w:val="16"/>
               </w:rPr>
-              <w:t xml:space="preserve">0.461</w:t>
-            </w:r>
-          </w:p>
-        </w:tc>
-        <w:tc>
-          <w:tcPr/>
-          <w:p>
-            <w:pPr>
-              <w:pStyle w:val="Compact"/>
-              <w:spacing w:before="20" w:after="20"/>
-              <w:jc w:val="left"/>
-            </w:pPr>
-            <w:r>
-              <w:rPr>
-                <w:rFonts w:ascii="Calibri" w:hAnsi="Calibri"/>
-                <w:sz w:val="16"/>
-              </w:rPr>
-              <w:t xml:space="preserve">0.469</w:t>
-            </w:r>
-          </w:p>
-        </w:tc>
-        <w:tc>
-          <w:tcPr/>
-          <w:p>
-            <w:pPr>
-              <w:pStyle w:val="Compact"/>
-              <w:spacing w:before="20" w:after="20"/>
-              <w:jc w:val="left"/>
-            </w:pPr>
-            <w:r>
-              <w:rPr>
-                <w:rFonts w:ascii="Calibri" w:hAnsi="Calibri"/>
-                <w:sz w:val="16"/>
-              </w:rPr>
-              <w:t xml:space="preserve">+0.199</w:t>
-            </w:r>
-          </w:p>
-        </w:tc>
-        <w:tc>
-          <w:tcPr/>
-          <w:p>
-            <w:pPr>
-              <w:pStyle w:val="Compact"/>
-              <w:spacing w:before="20" w:after="20"/>
-              <w:jc w:val="left"/>
-            </w:pPr>
-            <w:r>
-              <w:rPr>
-                <w:rFonts w:ascii="Calibri" w:hAnsi="Calibri"/>
-                <w:sz w:val="16"/>
-              </w:rPr>
-              <w:t xml:space="preserve">+0.207</w:t>
+              <w:t xml:space="preserve">+0.199 [+0.172, +0.223]*</w:t>
+            </w:r>
+          </w:p>
+        </w:tc>
+        <w:tc>
+          <w:tcPr/>
+          <w:p>
+            <w:pPr>
+              <w:pStyle w:val="Compact"/>
+              <w:spacing w:before="20" w:after="20"/>
+              <w:jc w:val="left"/>
+            </w:pPr>
+            <w:r>
+              <w:rPr>
+                <w:rFonts w:ascii="Calibri" w:hAnsi="Calibri"/>
+                <w:sz w:val="16"/>
+              </w:rPr>
+              <w:t xml:space="preserve">+0.207 [+0.184, +0.234]*</w:t>
+            </w:r>
+          </w:p>
+        </w:tc>
+        <w:tc>
+          <w:tcPr/>
+          <w:p>
+            <w:pPr>
+              <w:pStyle w:val="Compact"/>
+              <w:spacing w:before="20" w:after="20"/>
+              <w:jc w:val="left"/>
+            </w:pPr>
+            <w:r>
+              <w:rPr>
+                <w:rFonts w:ascii="Calibri" w:hAnsi="Calibri"/>
+                <w:sz w:val="16"/>
+              </w:rPr>
+              <w:t xml:space="preserve">-0.009 [-0.058, +0.036]</w:t>
             </w:r>
           </w:p>
         </w:tc>
@@ -8507,58 +8435,41 @@
                 <w:rFonts w:ascii="Calibri" w:hAnsi="Calibri"/>
                 <w:sz w:val="16"/>
               </w:rPr>
-              <w:t xml:space="preserve">0.101</w:t>
-            </w:r>
-          </w:p>
-        </w:tc>
-        <w:tc>
-          <w:tcPr/>
-          <w:p>
-            <w:pPr>
-              <w:pStyle w:val="Compact"/>
-              <w:spacing w:before="20" w:after="20"/>
-              <w:jc w:val="left"/>
-            </w:pPr>
-            <w:r>
-              <w:rPr>
-                <w:rFonts w:ascii="Calibri" w:hAnsi="Calibri"/>
-                <w:sz w:val="16"/>
-              </w:rPr>
-              <w:t xml:space="preserve">0.106</w:t>
-            </w:r>
-          </w:p>
-        </w:tc>
-        <w:tc>
-          <w:tcPr/>
-          <w:p>
-            <w:pPr>
-              <w:pStyle w:val="Compact"/>
-              <w:spacing w:before="20" w:after="20"/>
-              <w:jc w:val="left"/>
-            </w:pPr>
-            <w:r>
-              <w:rPr>
-                <w:rFonts w:ascii="Calibri" w:hAnsi="Calibri"/>
-                <w:sz w:val="16"/>
-              </w:rPr>
-              <w:t xml:space="preserve">+0.001</w:t>
-            </w:r>
-          </w:p>
-        </w:tc>
-        <w:tc>
-          <w:tcPr/>
-          <w:p>
-            <w:pPr>
-              <w:pStyle w:val="Compact"/>
-              <w:spacing w:before="20" w:after="20"/>
-              <w:jc w:val="left"/>
-            </w:pPr>
-            <w:r>
-              <w:rPr>
-                <w:rFonts w:ascii="Calibri" w:hAnsi="Calibri"/>
-                <w:sz w:val="16"/>
-              </w:rPr>
-              <w:t xml:space="preserve">+0.006</w:t>
+              <w:t xml:space="preserve">+0.001 [+0.000, +0.003]*</w:t>
+            </w:r>
+          </w:p>
+        </w:tc>
+        <w:tc>
+          <w:tcPr/>
+          <w:p>
+            <w:pPr>
+              <w:pStyle w:val="Compact"/>
+              <w:spacing w:before="20" w:after="20"/>
+              <w:jc w:val="left"/>
+            </w:pPr>
+            <w:r>
+              <w:rPr>
+                <w:rFonts w:ascii="Calibri" w:hAnsi="Calibri"/>
+                <w:sz w:val="16"/>
+              </w:rPr>
+              <w:t xml:space="preserve">+0.006 [+0.003, +0.010]*</w:t>
+            </w:r>
+          </w:p>
+        </w:tc>
+        <w:tc>
+          <w:tcPr/>
+          <w:p>
+            <w:pPr>
+              <w:pStyle w:val="Compact"/>
+              <w:spacing w:before="20" w:after="20"/>
+              <w:jc w:val="left"/>
+            </w:pPr>
+            <w:r>
+              <w:rPr>
+                <w:rFonts w:ascii="Calibri" w:hAnsi="Calibri"/>
+                <w:sz w:val="16"/>
+              </w:rPr>
+              <w:t xml:space="preserve">-0.005 [-0.010, -0.001]*</w:t>
             </w:r>
           </w:p>
         </w:tc>
@@ -8679,58 +8590,41 @@
                 <w:rFonts w:ascii="Calibri" w:hAnsi="Calibri"/>
                 <w:sz w:val="16"/>
               </w:rPr>
-              <w:t xml:space="preserve">0.370</w:t>
-            </w:r>
-          </w:p>
-        </w:tc>
-        <w:tc>
-          <w:tcPr/>
-          <w:p>
-            <w:pPr>
-              <w:pStyle w:val="Compact"/>
-              <w:spacing w:before="20" w:after="20"/>
-              <w:jc w:val="left"/>
-            </w:pPr>
-            <w:r>
-              <w:rPr>
-                <w:rFonts w:ascii="Calibri" w:hAnsi="Calibri"/>
-                <w:sz w:val="16"/>
-              </w:rPr>
-              <w:t xml:space="preserve">0.348</w:t>
-            </w:r>
-          </w:p>
-        </w:tc>
-        <w:tc>
-          <w:tcPr/>
-          <w:p>
-            <w:pPr>
-              <w:pStyle w:val="Compact"/>
-              <w:spacing w:before="20" w:after="20"/>
-              <w:jc w:val="left"/>
-            </w:pPr>
-            <w:r>
-              <w:rPr>
-                <w:rFonts w:ascii="Calibri" w:hAnsi="Calibri"/>
-                <w:sz w:val="16"/>
-              </w:rPr>
-              <w:t xml:space="preserve">+0.070</w:t>
-            </w:r>
-          </w:p>
-        </w:tc>
-        <w:tc>
-          <w:tcPr/>
-          <w:p>
-            <w:pPr>
-              <w:pStyle w:val="Compact"/>
-              <w:spacing w:before="20" w:after="20"/>
-              <w:jc w:val="left"/>
-            </w:pPr>
-            <w:r>
-              <w:rPr>
-                <w:rFonts w:ascii="Calibri" w:hAnsi="Calibri"/>
-                <w:sz w:val="16"/>
-              </w:rPr>
-              <w:t xml:space="preserve">+0.048</w:t>
+              <w:t xml:space="preserve">+0.071 [+0.046, +0.094]</w:t>
+            </w:r>
+          </w:p>
+        </w:tc>
+        <w:tc>
+          <w:tcPr/>
+          <w:p>
+            <w:pPr>
+              <w:pStyle w:val="Compact"/>
+              <w:spacing w:before="20" w:after="20"/>
+              <w:jc w:val="left"/>
+            </w:pPr>
+            <w:r>
+              <w:rPr>
+                <w:rFonts w:ascii="Calibri" w:hAnsi="Calibri"/>
+                <w:sz w:val="16"/>
+              </w:rPr>
+              <w:t xml:space="preserve">+0.048 [+0.024, +0.074]</w:t>
+            </w:r>
+          </w:p>
+        </w:tc>
+        <w:tc>
+          <w:tcPr/>
+          <w:p>
+            <w:pPr>
+              <w:pStyle w:val="Compact"/>
+              <w:spacing w:before="20" w:after="20"/>
+              <w:jc w:val="left"/>
+            </w:pPr>
+            <w:r>
+              <w:rPr>
+                <w:rFonts w:ascii="Calibri" w:hAnsi="Calibri"/>
+                <w:sz w:val="16"/>
+              </w:rPr>
+              <w:t xml:space="preserve">+0.023 [-0.021, +0.061]</w:t>
             </w:r>
           </w:p>
         </w:tc>
@@ -8851,58 +8745,41 @@
                 <w:rFonts w:ascii="Calibri" w:hAnsi="Calibri"/>
                 <w:sz w:val="16"/>
               </w:rPr>
-              <w:t xml:space="preserve">0.138</w:t>
-            </w:r>
-          </w:p>
-        </w:tc>
-        <w:tc>
-          <w:tcPr/>
-          <w:p>
-            <w:pPr>
-              <w:pStyle w:val="Compact"/>
-              <w:spacing w:before="20" w:after="20"/>
-              <w:jc w:val="left"/>
-            </w:pPr>
-            <w:r>
-              <w:rPr>
-                <w:rFonts w:ascii="Calibri" w:hAnsi="Calibri"/>
-                <w:sz w:val="16"/>
-              </w:rPr>
-              <w:t xml:space="preserve">0.136</w:t>
-            </w:r>
-          </w:p>
-        </w:tc>
-        <w:tc>
-          <w:tcPr/>
-          <w:p>
-            <w:pPr>
-              <w:pStyle w:val="Compact"/>
-              <w:spacing w:before="20" w:after="20"/>
-              <w:jc w:val="left"/>
-            </w:pPr>
-            <w:r>
-              <w:rPr>
-                <w:rFonts w:ascii="Calibri" w:hAnsi="Calibri"/>
-                <w:sz w:val="16"/>
-              </w:rPr>
-              <w:t xml:space="preserve">+0.038</w:t>
-            </w:r>
-          </w:p>
-        </w:tc>
-        <w:tc>
-          <w:tcPr/>
-          <w:p>
-            <w:pPr>
-              <w:pStyle w:val="Compact"/>
-              <w:spacing w:before="20" w:after="20"/>
-              <w:jc w:val="left"/>
-            </w:pPr>
-            <w:r>
-              <w:rPr>
-                <w:rFonts w:ascii="Calibri" w:hAnsi="Calibri"/>
-                <w:sz w:val="16"/>
-              </w:rPr>
-              <w:t xml:space="preserve">+0.036</w:t>
+              <w:t xml:space="preserve">+0.038 [+0.032, +0.043]*</w:t>
+            </w:r>
+          </w:p>
+        </w:tc>
+        <w:tc>
+          <w:tcPr/>
+          <w:p>
+            <w:pPr>
+              <w:pStyle w:val="Compact"/>
+              <w:spacing w:before="20" w:after="20"/>
+              <w:jc w:val="left"/>
+            </w:pPr>
+            <w:r>
+              <w:rPr>
+                <w:rFonts w:ascii="Calibri" w:hAnsi="Calibri"/>
+                <w:sz w:val="16"/>
+              </w:rPr>
+              <w:t xml:space="preserve">+0.036 [+0.031, +0.043]*</w:t>
+            </w:r>
+          </w:p>
+        </w:tc>
+        <w:tc>
+          <w:tcPr/>
+          <w:p>
+            <w:pPr>
+              <w:pStyle w:val="Compact"/>
+              <w:spacing w:before="20" w:after="20"/>
+              <w:jc w:val="left"/>
+            </w:pPr>
+            <w:r>
+              <w:rPr>
+                <w:rFonts w:ascii="Calibri" w:hAnsi="Calibri"/>
+                <w:sz w:val="16"/>
+              </w:rPr>
+              <w:t xml:space="preserve">+0.001 [-0.009, +0.011]*</w:t>
             </w:r>
           </w:p>
         </w:tc>
@@ -9023,58 +8900,41 @@
                 <w:rFonts w:ascii="Calibri" w:hAnsi="Calibri"/>
                 <w:sz w:val="16"/>
               </w:rPr>
-              <w:t xml:space="preserve">0.237</w:t>
-            </w:r>
-          </w:p>
-        </w:tc>
-        <w:tc>
-          <w:tcPr/>
-          <w:p>
-            <w:pPr>
-              <w:pStyle w:val="Compact"/>
-              <w:spacing w:before="20" w:after="20"/>
-              <w:jc w:val="left"/>
-            </w:pPr>
-            <w:r>
-              <w:rPr>
-                <w:rFonts w:ascii="Calibri" w:hAnsi="Calibri"/>
-                <w:sz w:val="16"/>
-              </w:rPr>
-              <w:t xml:space="preserve">0.241</w:t>
-            </w:r>
-          </w:p>
-        </w:tc>
-        <w:tc>
-          <w:tcPr/>
-          <w:p>
-            <w:pPr>
-              <w:pStyle w:val="Compact"/>
-              <w:spacing w:before="20" w:after="20"/>
-              <w:jc w:val="left"/>
-            </w:pPr>
-            <w:r>
-              <w:rPr>
-                <w:rFonts w:ascii="Calibri" w:hAnsi="Calibri"/>
-                <w:sz w:val="16"/>
-              </w:rPr>
-              <w:t xml:space="preserve">+0.078</w:t>
-            </w:r>
-          </w:p>
-        </w:tc>
-        <w:tc>
-          <w:tcPr/>
-          <w:p>
-            <w:pPr>
-              <w:pStyle w:val="Compact"/>
-              <w:spacing w:before="20" w:after="20"/>
-              <w:jc w:val="left"/>
-            </w:pPr>
-            <w:r>
-              <w:rPr>
-                <w:rFonts w:ascii="Calibri" w:hAnsi="Calibri"/>
-                <w:sz w:val="16"/>
-              </w:rPr>
-              <w:t xml:space="preserve">+0.082</w:t>
+              <w:t xml:space="preserve">+0.078 [+0.062, +0.093]</w:t>
+            </w:r>
+          </w:p>
+        </w:tc>
+        <w:tc>
+          <w:tcPr/>
+          <w:p>
+            <w:pPr>
+              <w:pStyle w:val="Compact"/>
+              <w:spacing w:before="20" w:after="20"/>
+              <w:jc w:val="left"/>
+            </w:pPr>
+            <w:r>
+              <w:rPr>
+                <w:rFonts w:ascii="Calibri" w:hAnsi="Calibri"/>
+                <w:sz w:val="16"/>
+              </w:rPr>
+              <w:t xml:space="preserve">+0.082 [+0.068, +0.097]*</w:t>
+            </w:r>
+          </w:p>
+        </w:tc>
+        <w:tc>
+          <w:tcPr/>
+          <w:p>
+            <w:pPr>
+              <w:pStyle w:val="Compact"/>
+              <w:spacing w:before="20" w:after="20"/>
+              <w:jc w:val="left"/>
+            </w:pPr>
+            <w:r>
+              <w:rPr>
+                <w:rFonts w:ascii="Calibri" w:hAnsi="Calibri"/>
+                <w:sz w:val="16"/>
+              </w:rPr>
+              <w:t xml:space="preserve">-0.005 [-0.030, +0.019]*</w:t>
             </w:r>
           </w:p>
         </w:tc>
@@ -9195,58 +9055,41 @@
                 <w:rFonts w:ascii="Calibri" w:hAnsi="Calibri"/>
                 <w:sz w:val="16"/>
               </w:rPr>
-              <w:t xml:space="preserve">0.252</w:t>
-            </w:r>
-          </w:p>
-        </w:tc>
-        <w:tc>
-          <w:tcPr/>
-          <w:p>
-            <w:pPr>
-              <w:pStyle w:val="Compact"/>
-              <w:spacing w:before="20" w:after="20"/>
-              <w:jc w:val="left"/>
-            </w:pPr>
-            <w:r>
-              <w:rPr>
-                <w:rFonts w:ascii="Calibri" w:hAnsi="Calibri"/>
-                <w:sz w:val="16"/>
-              </w:rPr>
-              <w:t xml:space="preserve">0.251</w:t>
-            </w:r>
-          </w:p>
-        </w:tc>
-        <w:tc>
-          <w:tcPr/>
-          <w:p>
-            <w:pPr>
-              <w:pStyle w:val="Compact"/>
-              <w:spacing w:before="20" w:after="20"/>
-              <w:jc w:val="left"/>
-            </w:pPr>
-            <w:r>
-              <w:rPr>
-                <w:rFonts w:ascii="Calibri" w:hAnsi="Calibri"/>
-                <w:sz w:val="16"/>
-              </w:rPr>
-              <w:t xml:space="preserve">+0.159</w:t>
-            </w:r>
-          </w:p>
-        </w:tc>
-        <w:tc>
-          <w:tcPr/>
-          <w:p>
-            <w:pPr>
-              <w:pStyle w:val="Compact"/>
-              <w:spacing w:before="20" w:after="20"/>
-              <w:jc w:val="left"/>
-            </w:pPr>
-            <w:r>
-              <w:rPr>
-                <w:rFonts w:ascii="Calibri" w:hAnsi="Calibri"/>
-                <w:sz w:val="16"/>
-              </w:rPr>
-              <w:t xml:space="preserve">+0.158</w:t>
+              <w:t xml:space="preserve">+0.159 [+0.151, +0.168]*</w:t>
+            </w:r>
+          </w:p>
+        </w:tc>
+        <w:tc>
+          <w:tcPr/>
+          <w:p>
+            <w:pPr>
+              <w:pStyle w:val="Compact"/>
+              <w:spacing w:before="20" w:after="20"/>
+              <w:jc w:val="left"/>
+            </w:pPr>
+            <w:r>
+              <w:rPr>
+                <w:rFonts w:ascii="Calibri" w:hAnsi="Calibri"/>
+                <w:sz w:val="16"/>
+              </w:rPr>
+              <w:t xml:space="preserve">+0.158 [+0.150, +0.167]*</w:t>
+            </w:r>
+          </w:p>
+        </w:tc>
+        <w:tc>
+          <w:tcPr/>
+          <w:p>
+            <w:pPr>
+              <w:pStyle w:val="Compact"/>
+              <w:spacing w:before="20" w:after="20"/>
+              <w:jc w:val="left"/>
+            </w:pPr>
+            <w:r>
+              <w:rPr>
+                <w:rFonts w:ascii="Calibri" w:hAnsi="Calibri"/>
+                <w:sz w:val="16"/>
+              </w:rPr>
+              <w:t xml:space="preserve">+0.001 [-0.011, +0.014]*</w:t>
             </w:r>
           </w:p>
         </w:tc>
@@ -9367,58 +9210,41 @@
                 <w:rFonts w:ascii="Calibri" w:hAnsi="Calibri"/>
                 <w:sz w:val="16"/>
               </w:rPr>
-              <w:t xml:space="preserve">0.336</w:t>
-            </w:r>
-          </w:p>
-        </w:tc>
-        <w:tc>
-          <w:tcPr/>
-          <w:p>
-            <w:pPr>
-              <w:pStyle w:val="Compact"/>
-              <w:spacing w:before="20" w:after="20"/>
-              <w:jc w:val="left"/>
-            </w:pPr>
-            <w:r>
-              <w:rPr>
-                <w:rFonts w:ascii="Calibri" w:hAnsi="Calibri"/>
-                <w:sz w:val="16"/>
-              </w:rPr>
-              <w:t xml:space="preserve">0.352</w:t>
-            </w:r>
-          </w:p>
-        </w:tc>
-        <w:tc>
-          <w:tcPr/>
-          <w:p>
-            <w:pPr>
-              <w:pStyle w:val="Compact"/>
-              <w:spacing w:before="20" w:after="20"/>
-              <w:jc w:val="left"/>
-            </w:pPr>
-            <w:r>
-              <w:rPr>
-                <w:rFonts w:ascii="Calibri" w:hAnsi="Calibri"/>
-                <w:sz w:val="16"/>
-              </w:rPr>
-              <w:t xml:space="preserve">+0.180</w:t>
-            </w:r>
-          </w:p>
-        </w:tc>
-        <w:tc>
-          <w:tcPr/>
-          <w:p>
-            <w:pPr>
-              <w:pStyle w:val="Compact"/>
-              <w:spacing w:before="20" w:after="20"/>
-              <w:jc w:val="left"/>
-            </w:pPr>
-            <w:r>
-              <w:rPr>
-                <w:rFonts w:ascii="Calibri" w:hAnsi="Calibri"/>
-                <w:sz w:val="16"/>
-              </w:rPr>
-              <w:t xml:space="preserve">+0.196</w:t>
+              <w:t xml:space="preserve">+0.180 [+0.155, +0.206]*</w:t>
+            </w:r>
+          </w:p>
+        </w:tc>
+        <w:tc>
+          <w:tcPr/>
+          <w:p>
+            <w:pPr>
+              <w:pStyle w:val="Compact"/>
+              <w:spacing w:before="20" w:after="20"/>
+              <w:jc w:val="left"/>
+            </w:pPr>
+            <w:r>
+              <w:rPr>
+                <w:rFonts w:ascii="Calibri" w:hAnsi="Calibri"/>
+                <w:sz w:val="16"/>
+              </w:rPr>
+              <w:t xml:space="preserve">+0.196 [+0.173, +0.220]*</w:t>
+            </w:r>
+          </w:p>
+        </w:tc>
+        <w:tc>
+          <w:tcPr/>
+          <w:p>
+            <w:pPr>
+              <w:pStyle w:val="Compact"/>
+              <w:spacing w:before="20" w:after="20"/>
+              <w:jc w:val="left"/>
+            </w:pPr>
+            <w:r>
+              <w:rPr>
+                <w:rFonts w:ascii="Calibri" w:hAnsi="Calibri"/>
+                <w:sz w:val="16"/>
+              </w:rPr>
+              <w:t xml:space="preserve">-0.017 [-0.062, +0.028]</w:t>
             </w:r>
           </w:p>
         </w:tc>
@@ -9539,58 +9365,41 @@
                 <w:rFonts w:ascii="Calibri" w:hAnsi="Calibri"/>
                 <w:sz w:val="16"/>
               </w:rPr>
-              <w:t xml:space="preserve">0.090</w:t>
-            </w:r>
-          </w:p>
-        </w:tc>
-        <w:tc>
-          <w:tcPr/>
-          <w:p>
-            <w:pPr>
-              <w:pStyle w:val="Compact"/>
-              <w:spacing w:before="20" w:after="20"/>
-              <w:jc w:val="left"/>
-            </w:pPr>
-            <w:r>
-              <w:rPr>
-                <w:rFonts w:ascii="Calibri" w:hAnsi="Calibri"/>
-                <w:sz w:val="16"/>
-              </w:rPr>
-              <w:t xml:space="preserve">0.114</w:t>
-            </w:r>
-          </w:p>
-        </w:tc>
-        <w:tc>
-          <w:tcPr/>
-          <w:p>
-            <w:pPr>
-              <w:pStyle w:val="Compact"/>
-              <w:spacing w:before="20" w:after="20"/>
-              <w:jc w:val="left"/>
-            </w:pPr>
-            <w:r>
-              <w:rPr>
-                <w:rFonts w:ascii="Calibri" w:hAnsi="Calibri"/>
-                <w:sz w:val="16"/>
-              </w:rPr>
-              <w:t xml:space="preserve">+0.027</w:t>
-            </w:r>
-          </w:p>
-        </w:tc>
-        <w:tc>
-          <w:tcPr/>
-          <w:p>
-            <w:pPr>
-              <w:pStyle w:val="Compact"/>
-              <w:spacing w:before="20" w:after="20"/>
-              <w:jc w:val="left"/>
-            </w:pPr>
-            <w:r>
-              <w:rPr>
-                <w:rFonts w:ascii="Calibri" w:hAnsi="Calibri"/>
-                <w:sz w:val="16"/>
-              </w:rPr>
-              <w:t xml:space="preserve">+0.051</w:t>
+              <w:t xml:space="preserve">+0.027 [+0.020, +0.035]*</w:t>
+            </w:r>
+          </w:p>
+        </w:tc>
+        <w:tc>
+          <w:tcPr/>
+          <w:p>
+            <w:pPr>
+              <w:pStyle w:val="Compact"/>
+              <w:spacing w:before="20" w:after="20"/>
+              <w:jc w:val="left"/>
+            </w:pPr>
+            <w:r>
+              <w:rPr>
+                <w:rFonts w:ascii="Calibri" w:hAnsi="Calibri"/>
+                <w:sz w:val="16"/>
+              </w:rPr>
+              <w:t xml:space="preserve">+0.051 [+0.042, +0.059]*</w:t>
+            </w:r>
+          </w:p>
+        </w:tc>
+        <w:tc>
+          <w:tcPr/>
+          <w:p>
+            <w:pPr>
+              <w:pStyle w:val="Compact"/>
+              <w:spacing w:before="20" w:after="20"/>
+              <w:jc w:val="left"/>
+            </w:pPr>
+            <w:r>
+              <w:rPr>
+                <w:rFonts w:ascii="Calibri" w:hAnsi="Calibri"/>
+                <w:sz w:val="16"/>
+              </w:rPr>
+              <w:t xml:space="preserve">-0.023 [-0.034, -0.012]*</w:t>
             </w:r>
           </w:p>
         </w:tc>
@@ -9711,58 +9520,41 @@
                 <w:rFonts w:ascii="Calibri" w:hAnsi="Calibri"/>
                 <w:sz w:val="16"/>
               </w:rPr>
-              <w:t xml:space="preserve">0.252</w:t>
-            </w:r>
-          </w:p>
-        </w:tc>
-        <w:tc>
-          <w:tcPr/>
-          <w:p>
-            <w:pPr>
-              <w:pStyle w:val="Compact"/>
-              <w:spacing w:before="20" w:after="20"/>
-              <w:jc w:val="left"/>
-            </w:pPr>
-            <w:r>
-              <w:rPr>
-                <w:rFonts w:ascii="Calibri" w:hAnsi="Calibri"/>
-                <w:sz w:val="16"/>
-              </w:rPr>
-              <w:t xml:space="preserve">0.242</w:t>
-            </w:r>
-          </w:p>
-        </w:tc>
-        <w:tc>
-          <w:tcPr/>
-          <w:p>
-            <w:pPr>
-              <w:pStyle w:val="Compact"/>
-              <w:spacing w:before="20" w:after="20"/>
-              <w:jc w:val="left"/>
-            </w:pPr>
-            <w:r>
-              <w:rPr>
-                <w:rFonts w:ascii="Calibri" w:hAnsi="Calibri"/>
-                <w:sz w:val="16"/>
-              </w:rPr>
-              <w:t xml:space="preserve">+0.162</w:t>
-            </w:r>
-          </w:p>
-        </w:tc>
-        <w:tc>
-          <w:tcPr/>
-          <w:p>
-            <w:pPr>
-              <w:pStyle w:val="Compact"/>
-              <w:spacing w:before="20" w:after="20"/>
-              <w:jc w:val="left"/>
-            </w:pPr>
-            <w:r>
-              <w:rPr>
-                <w:rFonts w:ascii="Calibri" w:hAnsi="Calibri"/>
-                <w:sz w:val="16"/>
-              </w:rPr>
-              <w:t xml:space="preserve">+0.152</w:t>
+              <w:t xml:space="preserve">+0.162 [+0.140, +0.186]*</w:t>
+            </w:r>
+          </w:p>
+        </w:tc>
+        <w:tc>
+          <w:tcPr/>
+          <w:p>
+            <w:pPr>
+              <w:pStyle w:val="Compact"/>
+              <w:spacing w:before="20" w:after="20"/>
+              <w:jc w:val="left"/>
+            </w:pPr>
+            <w:r>
+              <w:rPr>
+                <w:rFonts w:ascii="Calibri" w:hAnsi="Calibri"/>
+                <w:sz w:val="16"/>
+              </w:rPr>
+              <w:t xml:space="preserve">+0.152 [+0.127, +0.178]*</w:t>
+            </w:r>
+          </w:p>
+        </w:tc>
+        <w:tc>
+          <w:tcPr/>
+          <w:p>
+            <w:pPr>
+              <w:pStyle w:val="Compact"/>
+              <w:spacing w:before="20" w:after="20"/>
+              <w:jc w:val="left"/>
+            </w:pPr>
+            <w:r>
+              <w:rPr>
+                <w:rFonts w:ascii="Calibri" w:hAnsi="Calibri"/>
+                <w:sz w:val="16"/>
+              </w:rPr>
+              <w:t xml:space="preserve">+0.011 [-0.036, +0.057]</w:t>
             </w:r>
           </w:p>
         </w:tc>
@@ -9883,58 +9675,41 @@
                 <w:rFonts w:ascii="Calibri" w:hAnsi="Calibri"/>
                 <w:sz w:val="16"/>
               </w:rPr>
-              <w:t xml:space="preserve">0.166</w:t>
-            </w:r>
-          </w:p>
-        </w:tc>
-        <w:tc>
-          <w:tcPr/>
-          <w:p>
-            <w:pPr>
-              <w:pStyle w:val="Compact"/>
-              <w:spacing w:before="20" w:after="20"/>
-              <w:jc w:val="left"/>
-            </w:pPr>
-            <w:r>
-              <w:rPr>
-                <w:rFonts w:ascii="Calibri" w:hAnsi="Calibri"/>
-                <w:sz w:val="16"/>
-              </w:rPr>
-              <w:t xml:space="preserve">0.160</w:t>
-            </w:r>
-          </w:p>
-        </w:tc>
-        <w:tc>
-          <w:tcPr/>
-          <w:p>
-            <w:pPr>
-              <w:pStyle w:val="Compact"/>
-              <w:spacing w:before="20" w:after="20"/>
-              <w:jc w:val="left"/>
-            </w:pPr>
-            <w:r>
-              <w:rPr>
-                <w:rFonts w:ascii="Calibri" w:hAnsi="Calibri"/>
-                <w:sz w:val="16"/>
-              </w:rPr>
-              <w:t xml:space="preserve">+0.162</w:t>
-            </w:r>
-          </w:p>
-        </w:tc>
-        <w:tc>
-          <w:tcPr/>
-          <w:p>
-            <w:pPr>
-              <w:pStyle w:val="Compact"/>
-              <w:spacing w:before="20" w:after="20"/>
-              <w:jc w:val="left"/>
-            </w:pPr>
-            <w:r>
-              <w:rPr>
-                <w:rFonts w:ascii="Calibri" w:hAnsi="Calibri"/>
-                <w:sz w:val="16"/>
-              </w:rPr>
-              <w:t xml:space="preserve">+0.156</w:t>
+              <w:t xml:space="preserve">+0.163 [+0.140, +0.186]*</w:t>
+            </w:r>
+          </w:p>
+        </w:tc>
+        <w:tc>
+          <w:tcPr/>
+          <w:p>
+            <w:pPr>
+              <w:pStyle w:val="Compact"/>
+              <w:spacing w:before="20" w:after="20"/>
+              <w:jc w:val="left"/>
+            </w:pPr>
+            <w:r>
+              <w:rPr>
+                <w:rFonts w:ascii="Calibri" w:hAnsi="Calibri"/>
+                <w:sz w:val="16"/>
+              </w:rPr>
+              <w:t xml:space="preserve">+0.156 [+0.135, +0.180]*</w:t>
+            </w:r>
+          </w:p>
+        </w:tc>
+        <w:tc>
+          <w:tcPr/>
+          <w:p>
+            <w:pPr>
+              <w:pStyle w:val="Compact"/>
+              <w:spacing w:before="20" w:after="20"/>
+              <w:jc w:val="left"/>
+            </w:pPr>
+            <w:r>
+              <w:rPr>
+                <w:rFonts w:ascii="Calibri" w:hAnsi="Calibri"/>
+                <w:sz w:val="16"/>
+              </w:rPr>
+              <w:t xml:space="preserve">+0.006 [-0.035, +0.045]</w:t>
             </w:r>
           </w:p>
         </w:tc>
@@ -10055,58 +9830,41 @@
                 <w:rFonts w:ascii="Calibri" w:hAnsi="Calibri"/>
                 <w:sz w:val="16"/>
               </w:rPr>
-              <w:t xml:space="preserve">0.155</w:t>
-            </w:r>
-          </w:p>
-        </w:tc>
-        <w:tc>
-          <w:tcPr/>
-          <w:p>
-            <w:pPr>
-              <w:pStyle w:val="Compact"/>
-              <w:spacing w:before="20" w:after="20"/>
-              <w:jc w:val="left"/>
-            </w:pPr>
-            <w:r>
-              <w:rPr>
-                <w:rFonts w:ascii="Calibri" w:hAnsi="Calibri"/>
-                <w:sz w:val="16"/>
-              </w:rPr>
-              <w:t xml:space="preserve">0.149</w:t>
-            </w:r>
-          </w:p>
-        </w:tc>
-        <w:tc>
-          <w:tcPr/>
-          <w:p>
-            <w:pPr>
-              <w:pStyle w:val="Compact"/>
-              <w:spacing w:before="20" w:after="20"/>
-              <w:jc w:val="left"/>
-            </w:pPr>
-            <w:r>
-              <w:rPr>
-                <w:rFonts w:ascii="Calibri" w:hAnsi="Calibri"/>
-                <w:sz w:val="16"/>
-              </w:rPr>
-              <w:t xml:space="preserve">+0.057</w:t>
-            </w:r>
-          </w:p>
-        </w:tc>
-        <w:tc>
-          <w:tcPr/>
-          <w:p>
-            <w:pPr>
-              <w:pStyle w:val="Compact"/>
-              <w:spacing w:before="20" w:after="20"/>
-              <w:jc w:val="left"/>
-            </w:pPr>
-            <w:r>
-              <w:rPr>
-                <w:rFonts w:ascii="Calibri" w:hAnsi="Calibri"/>
-                <w:sz w:val="16"/>
-              </w:rPr>
-              <w:t xml:space="preserve">+0.051</w:t>
+              <w:t xml:space="preserve">+0.057 [+0.046, +0.068]*</w:t>
+            </w:r>
+          </w:p>
+        </w:tc>
+        <w:tc>
+          <w:tcPr/>
+          <w:p>
+            <w:pPr>
+              <w:pStyle w:val="Compact"/>
+              <w:spacing w:before="20" w:after="20"/>
+              <w:jc w:val="left"/>
+            </w:pPr>
+            <w:r>
+              <w:rPr>
+                <w:rFonts w:ascii="Calibri" w:hAnsi="Calibri"/>
+                <w:sz w:val="16"/>
+              </w:rPr>
+              <w:t xml:space="preserve">+0.051 [+0.041, +0.060]*</w:t>
+            </w:r>
+          </w:p>
+        </w:tc>
+        <w:tc>
+          <w:tcPr/>
+          <w:p>
+            <w:pPr>
+              <w:pStyle w:val="Compact"/>
+              <w:spacing w:before="20" w:after="20"/>
+              <w:jc w:val="left"/>
+            </w:pPr>
+            <w:r>
+              <w:rPr>
+                <w:rFonts w:ascii="Calibri" w:hAnsi="Calibri"/>
+                <w:sz w:val="16"/>
+              </w:rPr>
+              <w:t xml:space="preserve">+0.006 [-0.012, +0.025]</w:t>
             </w:r>
           </w:p>
         </w:tc>
@@ -10227,58 +9985,41 @@
                 <w:rFonts w:ascii="Calibri" w:hAnsi="Calibri"/>
                 <w:sz w:val="16"/>
               </w:rPr>
-              <w:t xml:space="preserve">0.123</w:t>
-            </w:r>
-          </w:p>
-        </w:tc>
-        <w:tc>
-          <w:tcPr/>
-          <w:p>
-            <w:pPr>
-              <w:pStyle w:val="Compact"/>
-              <w:spacing w:before="20" w:after="20"/>
-              <w:jc w:val="left"/>
-            </w:pPr>
-            <w:r>
-              <w:rPr>
-                <w:rFonts w:ascii="Calibri" w:hAnsi="Calibri"/>
-                <w:sz w:val="16"/>
-              </w:rPr>
-              <w:t xml:space="preserve">0.126</w:t>
-            </w:r>
-          </w:p>
-        </w:tc>
-        <w:tc>
-          <w:tcPr/>
-          <w:p>
-            <w:pPr>
-              <w:pStyle w:val="Compact"/>
-              <w:spacing w:before="20" w:after="20"/>
-              <w:jc w:val="left"/>
-            </w:pPr>
-            <w:r>
-              <w:rPr>
-                <w:rFonts w:ascii="Calibri" w:hAnsi="Calibri"/>
-                <w:sz w:val="16"/>
-              </w:rPr>
-              <w:t xml:space="preserve">+0.115</w:t>
-            </w:r>
-          </w:p>
-        </w:tc>
-        <w:tc>
-          <w:tcPr/>
-          <w:p>
-            <w:pPr>
-              <w:pStyle w:val="Compact"/>
-              <w:spacing w:before="20" w:after="20"/>
-              <w:jc w:val="left"/>
-            </w:pPr>
-            <w:r>
-              <w:rPr>
-                <w:rFonts w:ascii="Calibri" w:hAnsi="Calibri"/>
-                <w:sz w:val="16"/>
-              </w:rPr>
-              <w:t xml:space="preserve">+0.118</w:t>
+              <w:t xml:space="preserve">+0.115 [+0.104, +0.127]*</w:t>
+            </w:r>
+          </w:p>
+        </w:tc>
+        <w:tc>
+          <w:tcPr/>
+          <w:p>
+            <w:pPr>
+              <w:pStyle w:val="Compact"/>
+              <w:spacing w:before="20" w:after="20"/>
+              <w:jc w:val="left"/>
+            </w:pPr>
+            <w:r>
+              <w:rPr>
+                <w:rFonts w:ascii="Calibri" w:hAnsi="Calibri"/>
+                <w:sz w:val="16"/>
+              </w:rPr>
+              <w:t xml:space="preserve">+0.118 [+0.108, +0.128]*</w:t>
+            </w:r>
+          </w:p>
+        </w:tc>
+        <w:tc>
+          <w:tcPr/>
+          <w:p>
+            <w:pPr>
+              <w:pStyle w:val="Compact"/>
+              <w:spacing w:before="20" w:after="20"/>
+              <w:jc w:val="left"/>
+            </w:pPr>
+            <w:r>
+              <w:rPr>
+                <w:rFonts w:ascii="Calibri" w:hAnsi="Calibri"/>
+                <w:sz w:val="16"/>
+              </w:rPr>
+              <w:t xml:space="preserve">-0.003 [-0.019, +0.013]</w:t>
             </w:r>
           </w:p>
         </w:tc>
@@ -10327,7 +10068,7 @@
           <w:iCs/>
           <w:i/>
         </w:rPr>
-        <w:t xml:space="preserve">Table 4. Probability-elicitation design (mean elicited probability over 300 simulated customers, three independent calls per customer). Lift is the probability with the email minus the probability without it. RR = risk ratio. * the 95% paired-bootstrap interval of the risk ratio excludes the real value.</w:t>
+        <w:t xml:space="preserve">Table 4. Probability-elicitation design (mean elicited probability over 300 simulated customers, three independent calls per customer). Lift = probability with the email minus probability without it; gap = lift of the men’s email minus lift of the women’s email; intervals are 95% paired bootstrap intervals over customers (real values: normal approximation). RR = risk ratio. * the simulated and the real intervals do not overlap (for RR: the simulated interval excludes the real risk ratio).</w:t>
       </w:r>
     </w:p>
     <w:p>
@@ -10339,7 +10080,7 @@
           <wp:inline>
             <wp:extent cx="5334000" cy="2029239"/>
             <wp:effectExtent b="0" l="0" r="0" t="0"/>
-            <wp:docPr descr="Figure 2. Absolute lift in the probability of a visit and of a purchase after a men’s email (elicited-probability design). The dashed line and band are the real lift and its 95% interval. Note the logarithmic axis in panel b." title="" id="33" name="Picture"/>
+            <wp:docPr descr="Figure 2. Absolute lift in the probability of a visit and of a purchase after a men’s email (elicited-probability design). Bars are 95% intervals; the dashed line and band are the real lift and its 95% interval. Note the logarithmic axis in panel b." title="" id="33" name="Picture"/>
             <a:graphic>
               <a:graphicData uri="http://schemas.openxmlformats.org/drawingml/2006/picture">
                 <pic:pic>
@@ -10382,7 +10123,7 @@
         <w:pStyle w:val="ImageCaption"/>
       </w:pPr>
       <w:r>
-        <w:t xml:space="preserve">Figure 2. Absolute lift in the probability of a visit and of a purchase after a men’s email (elicited-probability design). The dashed line and band are the real lift and its 95% interval. Note the logarithmic axis in panel b.</w:t>
+        <w:t xml:space="preserve">Figure 2. Absolute lift in the probability of a visit and of a purchase after a men’s email (elicited-probability design). Bars are 95% intervals; the dashed line and band are the real lift and its 95% interval. Note the logarithmic axis in panel b.</w:t>
       </w:r>
     </w:p>
     <w:p>
@@ -10390,7 +10131,7 @@
         <w:pStyle w:val="BodyText"/>
       </w:pPr>
       <w:r>
-        <w:t xml:space="preserve">Four patterns emerge. First, the direction is mostly reproduced: the risk ratio exceeds one in all 12 probability-elicitation cells, but it is essentially one for GPT-4o-mini with the anchor for visits (1.01 and 1.06; the model answered about 10% regardless of the email), and Llama with the anchor gave a risk ratio below one (0.63) in the yes/no format for visits. Second, the size is unstable. For visits, Llama and Haiku without the anchor give lifts of +0.070 and +0.078, close to the real +0.077, but GPT-4o-mini gives +0.199 and Haiku with the anchor +0.159. Third, the absolute lift in purchase probability is overstated in every setting, by about 4 to 26 times (for example +0.180 for GPT-4o-mini without the anchor, against a real +0.0068). Providing the base rate lowers the no-email purchase probability toward the real 0.57% for Llama and Haiku but leaves the email-arm probability high, so the risk ratio explodes (16 to 45) while the absolute lift stays large. Fourth, the models hardly separate the men’s from the women’s email: the real risk ratio is higher for the men’s email (1.72 against 1.43 for visits), but in only six of twelve cells does the simulated men’s email have the larger effect, which is no better than chance, and the simulated differences are small and of inconsistent sign (between -0.024 and +0.022 in probability). Direct yes/no answers are not usable for rare events: without an email GPT-4o-mini answered</w:t>
+        <w:t xml:space="preserve">Four patterns emerge. First, the direction is mostly reproduced: the risk ratio exceeds one in all 12 probability-elicitation cells, but it is essentially one for GPT-4o-mini with the anchor for visits (1.01 and 1.06; the model answered about 10% regardless of the email), and Llama with the anchor gave a risk ratio below one (0.63) in the yes/no format for visits. Second, the size is unstable. For visits, Llama and Haiku without the anchor give lifts of +0.070 and +0.078, close to the real +0.077, but GPT-4o-mini gives +0.199 and Haiku with the anchor +0.159. Third, the absolute lift in purchase probability is overstated in every setting, by about 4 to 26 times (for example +0.180 for GPT-4o-mini without the anchor, against a real +0.0068). Providing the base rate lowers the no-email purchase probability toward the real 0.57% for Llama and Haiku but leaves the email-arm probability high, so the risk ratio explodes (16 to 45) while the absolute lift stays large. Fourth, the models do not reliably separate the men’s from the women’s email. In reality the men’s email has the larger lift (+0.077 against +0.045 for visits, a gap of +0.031 with interval +0.024 to +0.038). In 10 of the 12 probability-elicitation cells the interval of the simulated gap includes zero; in the other two (GPT-4o-mini with the anchor) the women’s email is rated higher, the opposite of the real result. Direct yes/no answers are not usable for rare events: without an email GPT-4o-mini answered</w:t>
       </w:r>
       <w:r>
         <w:t xml:space="preserve"> </w:t>
@@ -10423,7 +10164,7 @@
         <w:t xml:space="preserve">”</w:t>
       </w:r>
       <w:r>
-        <w:t xml:space="preserve">, so the risk ratio is undefined, and the same happened with Llama and Haiku for purchases in several cells.</w:t>
+        <w:t xml:space="preserve">, so the risk ratio is undefined, and the same happened with Llama and Haiku for purchases in several cells. In absolute terms the yes/no purchase lifts range from +0.14 to +0.55, 21 to 81 times the real lift.</w:t>
       </w:r>
     </w:p>
     <w:bookmarkEnd w:id="35"/>

</xml_diff>